<commit_message>
Add initial planet terrain and third-person camera
- Removed the unused Rover2 object.
- Added an initial version of the planet terrain.
- Added a third-person camera that follows the rover.
</commit_message>
<xml_diff>
--- a/Docs/temp_commit.docx
+++ b/Docs/temp_commit.docx
@@ -9,72 +9,19 @@
         </w:rPr>
       </w:pPr>
       <w:r>
-        <w:t xml:space="preserve">- </w:t>
-      </w:r>
-      <w:proofErr w:type="spellStart"/>
-      <w:r>
-        <w:t>renamed</w:t>
-      </w:r>
-      <w:proofErr w:type="spellEnd"/>
-      <w:r>
-        <w:t xml:space="preserve"> </w:t>
-      </w:r>
-      <w:proofErr w:type="spellStart"/>
-      <w:r>
-        <w:t>materials</w:t>
-      </w:r>
-      <w:proofErr w:type="spellEnd"/>
-      <w:r>
         <w:rPr>
           <w:lang w:val="en-US"/>
         </w:rPr>
-        <w:t xml:space="preserve"> </w:t>
+        <w:t xml:space="preserve">- </w:t>
       </w:r>
-      <w:proofErr w:type="spellStart"/>
       <w:r>
-        <w:t>to</w:t>
-      </w:r>
-      <w:proofErr w:type="spellEnd"/>
-      <w:r>
-        <w:t xml:space="preserve"> English</w:t>
-      </w:r>
-    </w:p>
-    <w:p>
-      <w:pPr>
-        <w:rPr>
-          <w:lang w:val="en-US"/>
-        </w:rPr>
-      </w:pPr>
-      <w:r>
-        <w:rPr>
-          <w:lang w:val="en-US"/>
-        </w:rPr>
-        <w:t>- r</w:t>
+        <w:t xml:space="preserve">удален ненужный объект </w:t>
       </w:r>
       <w:r>
         <w:rPr>
           <w:lang w:val="en-US"/>
         </w:rPr>
-        <w:t xml:space="preserve">otated the rover to align with the correct axis </w:t>
-      </w:r>
-    </w:p>
-    <w:p>
-      <w:pPr>
-        <w:rPr>
-          <w:lang w:val="en-US"/>
-        </w:rPr>
-      </w:pPr>
-      <w:r>
-        <w:rPr>
-          <w:lang w:val="en-US"/>
-        </w:rPr>
-        <w:t>- a</w:t>
-      </w:r>
-      <w:r>
-        <w:rPr>
-          <w:lang w:val="en-US"/>
-        </w:rPr>
-        <w:t xml:space="preserve">dded wheel suspension to better convey the feeling of movement </w:t>
+        <w:t>rover2</w:t>
       </w:r>
     </w:p>
     <w:p>
@@ -82,15 +29,19 @@
         <w:rPr>
           <w:lang w:val="en-US"/>
         </w:rPr>
-        <w:t>- a</w:t>
+        <w:t xml:space="preserve">- </w:t>
       </w:r>
       <w:r>
-        <w:rPr>
-          <w:lang w:val="en-US"/>
-        </w:rPr>
-        <w:t>dded a physics-based movement system</w:t>
+        <w:t>добавлен первичный вариант поверхности планеты</w:t>
       </w:r>
     </w:p>
+    <w:p>
+      <w:r>
+        <w:t>- добавлено следование камеры за ровером (вид от третьего лица)</w:t>
+      </w:r>
+    </w:p>
+    <w:p/>
+    <w:p/>
     <w:sectPr>
       <w:pgSz w:w="11906" w:h="16838"/>
       <w:pgMar w:top="1134" w:right="850" w:bottom="1134" w:left="1701" w:header="708" w:footer="708" w:gutter="0"/>
@@ -704,6 +655,7 @@
   <w:style w:type="character" w:default="1" w:styleId="a0">
     <w:name w:val="Default Paragraph Font"/>
     <w:uiPriority w:val="1"/>
+    <w:semiHidden/>
     <w:unhideWhenUsed/>
   </w:style>
   <w:style w:type="table" w:default="1" w:styleId="a1">

</xml_diff>